<commit_message>
Segurança: cabeçalhos HTTP e documentação de segurança
- vercel.json: X-Frame-Options, HSTS, nosniff, Referrer-Policy e
  Permissions-Policy em todas as respostas
- dev-server.js aplica os mesmos cabeçalhos do vercel.json no localhost
- docs/seguranca.md: camadas, login e perfis, segredos, criar e trocar
  chaves, proteções, testes, riscos e quem tem acesso a quê
- Word: 14 - Segurança.docx (Liberação vira 15, Histórico vira 16)

Co-Authored-By: Claude Opus 5.5 <noreply@anthropic.com>
</commit_message>
<xml_diff>
--- a/docs/word/03 - Índice.docx
+++ b/docs/word/03 - Índice.docx
@@ -92,7 +92,7 @@
           <w:sz w:val="22"/>
           <w:szCs w:val="22"/>
         </w:rPr>
-        <w:t xml:space="preserve">Atualizado em 08 de outubro de 2026</w:t>
+        <w:t xml:space="preserve">Atualizado em 16 de outubro de 2026</w:t>
       </w:r>
     </w:p>
     <w:p>
@@ -1604,13 +1604,73 @@
               <w:rPr>
                 <w:color w:val="1C1FC8"/>
               </w:rPr>
+              <w:t xml:space="preserve">seguranca.md</w:t>
+            </w:r>
+          </w:p>
+        </w:tc>
+        <w:tc>
+          <w:tcPr>
+            <w:shd w:fill="F6F4FE" w:color="auto" w:val="clear"/>
+            <w:tcMar>
+              <w:top w:type="dxa" w:w="60"/>
+              <w:left w:type="dxa" w:w="100"/>
+              <w:bottom w:type="dxa" w:w="60"/>
+              <w:right w:type="dxa" w:w="100"/>
+            </w:tcMar>
+          </w:tcPr>
+          <w:p>
+            <w:pPr>
+              <w:spacing w:after="40" w:before="40"/>
+            </w:pPr>
+            <w:r>
+              <w:t xml:space="preserve">Quem mantém, opera ou audita</w:t>
+            </w:r>
+          </w:p>
+        </w:tc>
+        <w:tc>
+          <w:tcPr>
+            <w:shd w:fill="F6F4FE" w:color="auto" w:val="clear"/>
+            <w:tcMar>
+              <w:top w:type="dxa" w:w="60"/>
+              <w:left w:type="dxa" w:w="100"/>
+              <w:bottom w:type="dxa" w:w="60"/>
+              <w:right w:type="dxa" w:w="100"/>
+            </w:tcMar>
+          </w:tcPr>
+          <w:p>
+            <w:pPr>
+              <w:spacing w:after="40" w:before="40"/>
+            </w:pPr>
+            <w:r>
+              <w:t xml:space="preserve">Camadas de proteção, login e perfis, onde fica cada segredo, como criar e trocar chaves, como testar, riscos e quem tem acesso a quê</w:t>
+            </w:r>
+          </w:p>
+        </w:tc>
+      </w:tr>
+      <w:tr>
+        <w:tc>
+          <w:tcPr>
+            <w:tcMar>
+              <w:top w:type="dxa" w:w="60"/>
+              <w:left w:type="dxa" w:w="100"/>
+              <w:bottom w:type="dxa" w:w="60"/>
+              <w:right w:type="dxa" w:w="100"/>
+            </w:tcMar>
+          </w:tcPr>
+          <w:p>
+            <w:pPr>
+              <w:spacing w:after="40" w:before="40"/>
+            </w:pPr>
+            <w:r>
+              <w:rPr>
+                <w:color w:val="1C1FC8"/>
+              </w:rPr>
               <w:t xml:space="preserve">../CHANGELOG.md</w:t>
             </w:r>
           </w:p>
         </w:tc>
         <w:tc>
           <w:tcPr>
-            <w:shd w:fill="F6F4FE" w:color="auto" w:val="clear"/>
             <w:tcMar>
               <w:top w:type="dxa" w:w="60"/>
               <w:left w:type="dxa" w:w="100"/>
@@ -1629,7 +1689,6 @@
         </w:tc>
         <w:tc>
           <w:tcPr>
-            <w:shd w:fill="F6F4FE" w:color="auto" w:val="clear"/>
             <w:tcMar>
               <w:top w:type="dxa" w:w="60"/>
               <w:left w:type="dxa" w:w="100"/>

</xml_diff>